<commit_message>
Final report: add Table 1 and expanded analysis
</commit_message>
<xml_diff>
--- a/Report - WANG Shiyu.docx
+++ b/Report - WANG Shiyu.docx
@@ -147,36 +147,547 @@
     </w:p>
     <w:p>
       <w:r>
-        <w:t>The environment is represented by an 11-dimensional binary feature vector:</w:t>
-      </w:r>
-    </w:p>
-    <w:p>
-      <w:pPr>
-        <w:pStyle w:val="ListBullet"/>
-      </w:pPr>
-      <w:r>
-        <w:t>Danger indicators (straight, right, left)</w:t>
-      </w:r>
-    </w:p>
-    <w:p>
-      <w:pPr>
-        <w:pStyle w:val="ListBullet"/>
-      </w:pPr>
-      <w:r>
-        <w:t>Food direction relative to the head (left, right, up, down)</w:t>
-      </w:r>
-    </w:p>
-    <w:p>
-      <w:pPr>
-        <w:pStyle w:val="ListBullet"/>
-      </w:pPr>
-      <w:r>
-        <w:t>Current movement direction (one-hot encoding)</w:t>
+        <w:t>The environment is represented by an 11-dimensional binary feature vector. It captures (i) immediate collision risk, (ii) food direction relative to the head, and (iii) the current movement direction.</w:t>
       </w:r>
     </w:p>
     <w:p>
       <w:r>
-        <w:t>This compact state representation captures critical information efficiently.</w:t>
+        <w:t>Table 1 provides a precise definition of each dimension (all features are binary: 1=true, 0=false).</w:t>
+      </w:r>
+    </w:p>
+    <w:tbl>
+      <w:tblPr>
+        <w:tblStyle w:val="TableGrid"/>
+        <w:tblW w:type="auto" w:w="0"/>
+        <w:tblLook w:firstColumn="1" w:firstRow="1" w:lastColumn="0" w:lastRow="0" w:noHBand="0" w:noVBand="1" w:val="04A0"/>
+      </w:tblPr>
+      <w:tblGrid>
+        <w:gridCol w:w="2160"/>
+        <w:gridCol w:w="2160"/>
+        <w:gridCol w:w="2160"/>
+        <w:gridCol w:w="2160"/>
+      </w:tblGrid>
+      <w:tr>
+        <w:tc>
+          <w:tcPr>
+            <w:tcW w:type="dxa" w:w="2160"/>
+          </w:tcPr>
+          <w:p>
+            <w:r>
+              <w:t>Dim</w:t>
+            </w:r>
+          </w:p>
+        </w:tc>
+        <w:tc>
+          <w:tcPr>
+            <w:tcW w:type="dxa" w:w="2160"/>
+          </w:tcPr>
+          <w:p>
+            <w:r>
+              <w:t>Name</w:t>
+            </w:r>
+          </w:p>
+        </w:tc>
+        <w:tc>
+          <w:tcPr>
+            <w:tcW w:type="dxa" w:w="2160"/>
+          </w:tcPr>
+          <w:p>
+            <w:r>
+              <w:t>Meaning</w:t>
+            </w:r>
+          </w:p>
+        </w:tc>
+        <w:tc>
+          <w:tcPr>
+            <w:tcW w:type="dxa" w:w="2160"/>
+          </w:tcPr>
+          <w:p>
+            <w:r>
+              <w:t>Values</w:t>
+            </w:r>
+          </w:p>
+        </w:tc>
+      </w:tr>
+      <w:tr>
+        <w:tc>
+          <w:tcPr>
+            <w:tcW w:type="dxa" w:w="2160"/>
+          </w:tcPr>
+          <w:p>
+            <w:r>
+              <w:t>0</w:t>
+            </w:r>
+          </w:p>
+        </w:tc>
+        <w:tc>
+          <w:tcPr>
+            <w:tcW w:type="dxa" w:w="2160"/>
+          </w:tcPr>
+          <w:p>
+            <w:r>
+              <w:t>Danger Straight</w:t>
+            </w:r>
+          </w:p>
+        </w:tc>
+        <w:tc>
+          <w:tcPr>
+            <w:tcW w:type="dxa" w:w="2160"/>
+          </w:tcPr>
+          <w:p>
+            <w:r>
+              <w:t>Obstacle immediately in front of the head (wall or body)</w:t>
+            </w:r>
+          </w:p>
+        </w:tc>
+        <w:tc>
+          <w:tcPr>
+            <w:tcW w:type="dxa" w:w="2160"/>
+          </w:tcPr>
+          <w:p>
+            <w:r>
+              <w:t>1=danger, 0=safe</w:t>
+            </w:r>
+          </w:p>
+        </w:tc>
+      </w:tr>
+      <w:tr>
+        <w:tc>
+          <w:tcPr>
+            <w:tcW w:type="dxa" w:w="2160"/>
+          </w:tcPr>
+          <w:p>
+            <w:r>
+              <w:t>1</w:t>
+            </w:r>
+          </w:p>
+        </w:tc>
+        <w:tc>
+          <w:tcPr>
+            <w:tcW w:type="dxa" w:w="2160"/>
+          </w:tcPr>
+          <w:p>
+            <w:r>
+              <w:t>Danger Right</w:t>
+            </w:r>
+          </w:p>
+        </w:tc>
+        <w:tc>
+          <w:tcPr>
+            <w:tcW w:type="dxa" w:w="2160"/>
+          </w:tcPr>
+          <w:p>
+            <w:r>
+              <w:t>Obstacle immediately to the right of the head</w:t>
+            </w:r>
+          </w:p>
+        </w:tc>
+        <w:tc>
+          <w:tcPr>
+            <w:tcW w:type="dxa" w:w="2160"/>
+          </w:tcPr>
+          <w:p>
+            <w:r>
+              <w:t>1=danger, 0=safe</w:t>
+            </w:r>
+          </w:p>
+        </w:tc>
+      </w:tr>
+      <w:tr>
+        <w:tc>
+          <w:tcPr>
+            <w:tcW w:type="dxa" w:w="2160"/>
+          </w:tcPr>
+          <w:p>
+            <w:r>
+              <w:t>2</w:t>
+            </w:r>
+          </w:p>
+        </w:tc>
+        <w:tc>
+          <w:tcPr>
+            <w:tcW w:type="dxa" w:w="2160"/>
+          </w:tcPr>
+          <w:p>
+            <w:r>
+              <w:t>Danger Left</w:t>
+            </w:r>
+          </w:p>
+        </w:tc>
+        <w:tc>
+          <w:tcPr>
+            <w:tcW w:type="dxa" w:w="2160"/>
+          </w:tcPr>
+          <w:p>
+            <w:r>
+              <w:t>Obstacle immediately to the left of the head</w:t>
+            </w:r>
+          </w:p>
+        </w:tc>
+        <w:tc>
+          <w:tcPr>
+            <w:tcW w:type="dxa" w:w="2160"/>
+          </w:tcPr>
+          <w:p>
+            <w:r>
+              <w:t>1=danger, 0=safe</w:t>
+            </w:r>
+          </w:p>
+        </w:tc>
+      </w:tr>
+      <w:tr>
+        <w:tc>
+          <w:tcPr>
+            <w:tcW w:type="dxa" w:w="2160"/>
+          </w:tcPr>
+          <w:p>
+            <w:r>
+              <w:t>3</w:t>
+            </w:r>
+          </w:p>
+        </w:tc>
+        <w:tc>
+          <w:tcPr>
+            <w:tcW w:type="dxa" w:w="2160"/>
+          </w:tcPr>
+          <w:p>
+            <w:r>
+              <w:t>Food Left</w:t>
+            </w:r>
+          </w:p>
+        </w:tc>
+        <w:tc>
+          <w:tcPr>
+            <w:tcW w:type="dxa" w:w="2160"/>
+          </w:tcPr>
+          <w:p>
+            <w:r>
+              <w:t>Food is to the left of the head</w:t>
+            </w:r>
+          </w:p>
+        </w:tc>
+        <w:tc>
+          <w:tcPr>
+            <w:tcW w:type="dxa" w:w="2160"/>
+          </w:tcPr>
+          <w:p>
+            <w:r>
+              <w:t>1=yes, 0=no</w:t>
+            </w:r>
+          </w:p>
+        </w:tc>
+      </w:tr>
+      <w:tr>
+        <w:tc>
+          <w:tcPr>
+            <w:tcW w:type="dxa" w:w="2160"/>
+          </w:tcPr>
+          <w:p>
+            <w:r>
+              <w:t>4</w:t>
+            </w:r>
+          </w:p>
+        </w:tc>
+        <w:tc>
+          <w:tcPr>
+            <w:tcW w:type="dxa" w:w="2160"/>
+          </w:tcPr>
+          <w:p>
+            <w:r>
+              <w:t>Food Right</w:t>
+            </w:r>
+          </w:p>
+        </w:tc>
+        <w:tc>
+          <w:tcPr>
+            <w:tcW w:type="dxa" w:w="2160"/>
+          </w:tcPr>
+          <w:p>
+            <w:r>
+              <w:t>Food is to the right of the head</w:t>
+            </w:r>
+          </w:p>
+        </w:tc>
+        <w:tc>
+          <w:tcPr>
+            <w:tcW w:type="dxa" w:w="2160"/>
+          </w:tcPr>
+          <w:p>
+            <w:r>
+              <w:t>1=yes, 0=no</w:t>
+            </w:r>
+          </w:p>
+        </w:tc>
+      </w:tr>
+      <w:tr>
+        <w:tc>
+          <w:tcPr>
+            <w:tcW w:type="dxa" w:w="2160"/>
+          </w:tcPr>
+          <w:p>
+            <w:r>
+              <w:t>5</w:t>
+            </w:r>
+          </w:p>
+        </w:tc>
+        <w:tc>
+          <w:tcPr>
+            <w:tcW w:type="dxa" w:w="2160"/>
+          </w:tcPr>
+          <w:p>
+            <w:r>
+              <w:t>Food Up</w:t>
+            </w:r>
+          </w:p>
+        </w:tc>
+        <w:tc>
+          <w:tcPr>
+            <w:tcW w:type="dxa" w:w="2160"/>
+          </w:tcPr>
+          <w:p>
+            <w:r>
+              <w:t>Food is above the head</w:t>
+            </w:r>
+          </w:p>
+        </w:tc>
+        <w:tc>
+          <w:tcPr>
+            <w:tcW w:type="dxa" w:w="2160"/>
+          </w:tcPr>
+          <w:p>
+            <w:r>
+              <w:t>1=yes, 0=no</w:t>
+            </w:r>
+          </w:p>
+        </w:tc>
+      </w:tr>
+      <w:tr>
+        <w:tc>
+          <w:tcPr>
+            <w:tcW w:type="dxa" w:w="2160"/>
+          </w:tcPr>
+          <w:p>
+            <w:r>
+              <w:t>6</w:t>
+            </w:r>
+          </w:p>
+        </w:tc>
+        <w:tc>
+          <w:tcPr>
+            <w:tcW w:type="dxa" w:w="2160"/>
+          </w:tcPr>
+          <w:p>
+            <w:r>
+              <w:t>Food Down</w:t>
+            </w:r>
+          </w:p>
+        </w:tc>
+        <w:tc>
+          <w:tcPr>
+            <w:tcW w:type="dxa" w:w="2160"/>
+          </w:tcPr>
+          <w:p>
+            <w:r>
+              <w:t>Food is below the head</w:t>
+            </w:r>
+          </w:p>
+        </w:tc>
+        <w:tc>
+          <w:tcPr>
+            <w:tcW w:type="dxa" w:w="2160"/>
+          </w:tcPr>
+          <w:p>
+            <w:r>
+              <w:t>1=yes, 0=no</w:t>
+            </w:r>
+          </w:p>
+        </w:tc>
+      </w:tr>
+      <w:tr>
+        <w:tc>
+          <w:tcPr>
+            <w:tcW w:type="dxa" w:w="2160"/>
+          </w:tcPr>
+          <w:p>
+            <w:r>
+              <w:t>7</w:t>
+            </w:r>
+          </w:p>
+        </w:tc>
+        <w:tc>
+          <w:tcPr>
+            <w:tcW w:type="dxa" w:w="2160"/>
+          </w:tcPr>
+          <w:p>
+            <w:r>
+              <w:t>Move Left</w:t>
+            </w:r>
+          </w:p>
+        </w:tc>
+        <w:tc>
+          <w:tcPr>
+            <w:tcW w:type="dxa" w:w="2160"/>
+          </w:tcPr>
+          <w:p>
+            <w:r>
+              <w:t>Current movement direction is left</w:t>
+            </w:r>
+          </w:p>
+        </w:tc>
+        <w:tc>
+          <w:tcPr>
+            <w:tcW w:type="dxa" w:w="2160"/>
+          </w:tcPr>
+          <w:p>
+            <w:r>
+              <w:t>1=yes, 0=no</w:t>
+            </w:r>
+          </w:p>
+        </w:tc>
+      </w:tr>
+      <w:tr>
+        <w:tc>
+          <w:tcPr>
+            <w:tcW w:type="dxa" w:w="2160"/>
+          </w:tcPr>
+          <w:p>
+            <w:r>
+              <w:t>8</w:t>
+            </w:r>
+          </w:p>
+        </w:tc>
+        <w:tc>
+          <w:tcPr>
+            <w:tcW w:type="dxa" w:w="2160"/>
+          </w:tcPr>
+          <w:p>
+            <w:r>
+              <w:t>Move Right</w:t>
+            </w:r>
+          </w:p>
+        </w:tc>
+        <w:tc>
+          <w:tcPr>
+            <w:tcW w:type="dxa" w:w="2160"/>
+          </w:tcPr>
+          <w:p>
+            <w:r>
+              <w:t>Current movement direction is right</w:t>
+            </w:r>
+          </w:p>
+        </w:tc>
+        <w:tc>
+          <w:tcPr>
+            <w:tcW w:type="dxa" w:w="2160"/>
+          </w:tcPr>
+          <w:p>
+            <w:r>
+              <w:t>1=yes, 0=no</w:t>
+            </w:r>
+          </w:p>
+        </w:tc>
+      </w:tr>
+      <w:tr>
+        <w:tc>
+          <w:tcPr>
+            <w:tcW w:type="dxa" w:w="2160"/>
+          </w:tcPr>
+          <w:p>
+            <w:r>
+              <w:t>9</w:t>
+            </w:r>
+          </w:p>
+        </w:tc>
+        <w:tc>
+          <w:tcPr>
+            <w:tcW w:type="dxa" w:w="2160"/>
+          </w:tcPr>
+          <w:p>
+            <w:r>
+              <w:t>Move Up</w:t>
+            </w:r>
+          </w:p>
+        </w:tc>
+        <w:tc>
+          <w:tcPr>
+            <w:tcW w:type="dxa" w:w="2160"/>
+          </w:tcPr>
+          <w:p>
+            <w:r>
+              <w:t>Current movement direction is up</w:t>
+            </w:r>
+          </w:p>
+        </w:tc>
+        <w:tc>
+          <w:tcPr>
+            <w:tcW w:type="dxa" w:w="2160"/>
+          </w:tcPr>
+          <w:p>
+            <w:r>
+              <w:t>1=yes, 0=no</w:t>
+            </w:r>
+          </w:p>
+        </w:tc>
+      </w:tr>
+      <w:tr>
+        <w:tc>
+          <w:tcPr>
+            <w:tcW w:type="dxa" w:w="2160"/>
+          </w:tcPr>
+          <w:p>
+            <w:r>
+              <w:t>10</w:t>
+            </w:r>
+          </w:p>
+        </w:tc>
+        <w:tc>
+          <w:tcPr>
+            <w:tcW w:type="dxa" w:w="2160"/>
+          </w:tcPr>
+          <w:p>
+            <w:r>
+              <w:t>Move Down</w:t>
+            </w:r>
+          </w:p>
+        </w:tc>
+        <w:tc>
+          <w:tcPr>
+            <w:tcW w:type="dxa" w:w="2160"/>
+          </w:tcPr>
+          <w:p>
+            <w:r>
+              <w:t>Current movement direction is down</w:t>
+            </w:r>
+          </w:p>
+        </w:tc>
+        <w:tc>
+          <w:tcPr>
+            <w:tcW w:type="dxa" w:w="2160"/>
+          </w:tcPr>
+          <w:p>
+            <w:r>
+              <w:t>1=yes, 0=no</w:t>
+            </w:r>
+          </w:p>
+        </w:tc>
+      </w:tr>
+    </w:tbl>
+    <w:p>
+      <w:r>
+        <w:rPr>
+          <w:i/>
+        </w:rPr>
+        <w:t>Table 1: Definition of the 11D state vector</w:t>
+      </w:r>
+    </w:p>
+    <w:p>
+      <w:r>
+        <w:t>Note: ‘left/right/up/down’ are defined in screen coordinates relative to the head position (not relative to the current direction).</w:t>
+      </w:r>
+    </w:p>
+    <w:p>
+      <w:r>
+        <w:t>This compact representation avoids the full grid as input while preserving key information needed for safe navigation and food seeking.</w:t>
       </w:r>
     </w:p>
     <w:p>
@@ -282,6 +793,11 @@
         <w:t>Moving away from food: -0.5 (light shaping reward)</w:t>
       </w:r>
     </w:p>
+    <w:p>
+      <w:r>
+        <w:t>Reward design was refined iteratively. A sparse reward (food/death only) makes exploration inefficient, so a small living reward (+0.1) encourages movement and discovery of useful trajectories. To reduce unnecessary wandering, a light shaping penalty (−0.5) is applied when the snake moves away from the food. Finally, adding bonus and poison food types enriches the learning signal while keeping the core objective unchanged.</w:t>
+      </w:r>
+    </w:p>
     <w:p/>
     <w:p>
       <w:r>
@@ -371,7 +887,20 @@
     </w:p>
     <w:p>
       <w:r>
-        <w:t>LinearQNet – 4 fully connected layers: Input (11) → 256 → 128 → 64 → Output (3) with ReLU activations.</w:t>
+        <w:t>LinearQNet is a 4-layer fully connected network with ReLU activations:</w:t>
+      </w:r>
+    </w:p>
+    <w:p>
+      <w:pPr>
+        <w:jc w:val="center"/>
+      </w:pPr>
+      <w:r>
+        <w:t>11  →  256  →  128  →  64  →  3</w:t>
+      </w:r>
+    </w:p>
+    <w:p>
+      <w:r>
+        <w:t>The input is the 11D state vector and the output is the Q-value for each of the 3 relative actions (left/straight/right). The hidden layer widths decrease (256→128→64) to progressively compress features into higher-level abstractions while controlling model capacity. This structure is a common, stable baseline for small structured state spaces and converges reliably in this task.</w:t>
       </w:r>
     </w:p>
     <w:p>
@@ -464,51 +993,6 @@
         <w:t>The trained model is saved as model.pth.</w:t>
       </w:r>
     </w:p>
-    <w:p/>
-    <w:p>
-      <w:r>
-        <w:drawing>
-          <wp:inline xmlns:a="http://schemas.openxmlformats.org/drawingml/2006/main" xmlns:pic="http://schemas.openxmlformats.org/drawingml/2006/picture">
-            <wp:extent cx="5303520" cy="2651760"/>
-            <wp:docPr id="2" name="Picture 2"/>
-            <wp:cNvGraphicFramePr>
-              <a:graphicFrameLocks noChangeAspect="1"/>
-            </wp:cNvGraphicFramePr>
-            <a:graphic>
-              <a:graphicData uri="http://schemas.openxmlformats.org/drawingml/2006/picture">
-                <pic:pic>
-                  <pic:nvPicPr>
-                    <pic:cNvPr id="0" name="training_curve.png"/>
-                    <pic:cNvPicPr/>
-                  </pic:nvPicPr>
-                  <pic:blipFill>
-                    <a:blip r:embed="rId11"/>
-                    <a:stretch>
-                      <a:fillRect/>
-                    </a:stretch>
-                  </pic:blipFill>
-                  <pic:spPr>
-                    <a:xfrm>
-                      <a:off x="0" y="0"/>
-                      <a:ext cx="5303520" cy="2651760"/>
-                    </a:xfrm>
-                    <a:prstGeom prst="rect"/>
-                  </pic:spPr>
-                </pic:pic>
-              </a:graphicData>
-            </a:graphic>
-          </wp:inline>
-        </w:drawing>
-      </w:r>
-    </w:p>
-    <w:p>
-      <w:r>
-        <w:rPr>
-          <w:i/>
-        </w:rPr>
-        <w:t>Figure 2: Training curve (training_curve.png) demonstrating clear learning progress</w:t>
-      </w:r>
-    </w:p>
     <w:p>
       <w:pPr>
         <w:pStyle w:val="Heading1"/>
@@ -585,7 +1069,57 @@
     </w:p>
     <w:p>
       <w:r>
-        <w:t>The training curve shows steady improvement:</w:t>
+        <w:t>Training progress is evaluated using the episode score trajectory and a moving-average curve (Figure 2). Because the policy is trained under ε-greedy exploration, early episodes are noisy; as ε decays, the agent becomes more consistent.</w:t>
+      </w:r>
+    </w:p>
+    <w:p/>
+    <w:p>
+      <w:r>
+        <w:drawing>
+          <wp:inline xmlns:a="http://schemas.openxmlformats.org/drawingml/2006/main" xmlns:pic="http://schemas.openxmlformats.org/drawingml/2006/picture">
+            <wp:extent cx="5303520" cy="2651760"/>
+            <wp:docPr id="2" name="Picture 2"/>
+            <wp:cNvGraphicFramePr>
+              <a:graphicFrameLocks noChangeAspect="1"/>
+            </wp:cNvGraphicFramePr>
+            <a:graphic>
+              <a:graphicData uri="http://schemas.openxmlformats.org/drawingml/2006/picture">
+                <pic:pic>
+                  <pic:nvPicPr>
+                    <pic:cNvPr id="0" name="training_curve.png"/>
+                    <pic:cNvPicPr/>
+                  </pic:nvPicPr>
+                  <pic:blipFill>
+                    <a:blip r:embed="rId11"/>
+                    <a:stretch>
+                      <a:fillRect/>
+                    </a:stretch>
+                  </pic:blipFill>
+                  <pic:spPr>
+                    <a:xfrm>
+                      <a:off x="0" y="0"/>
+                      <a:ext cx="5303520" cy="2651760"/>
+                    </a:xfrm>
+                    <a:prstGeom prst="rect"/>
+                  </pic:spPr>
+                </pic:pic>
+              </a:graphicData>
+            </a:graphic>
+          </wp:inline>
+        </w:drawing>
+      </w:r>
+    </w:p>
+    <w:p>
+      <w:r>
+        <w:rPr>
+          <w:i/>
+        </w:rPr>
+        <w:t>Figure 2: Training curve (training_curve.png) demonstrating learning progress</w:t>
+      </w:r>
+    </w:p>
+    <w:p>
+      <w:r>
+        <w:t>Key observations from a typical run include:</w:t>
       </w:r>
     </w:p>
     <w:p>
@@ -593,7 +1127,7 @@
         <w:pStyle w:val="ListBullet"/>
       </w:pPr>
       <w:r>
-        <w:t>Early episodes: average score ≈ 0–3</w:t>
+        <w:t>Early episodes: low scores with frequent wall/self collisions during exploration.</w:t>
       </w:r>
     </w:p>
     <w:p>
@@ -601,12 +1135,20 @@
         <w:pStyle w:val="ListBullet"/>
       </w:pPr>
       <w:r>
-        <w:t>Later episodes: average score stabilizes at 18–22, with peak single-game scores reaching 40</w:t>
+        <w:t>Mid training: gradual improvement as the agent learns basic obstacle avoidance and food-seeking behavior.</w:t>
+      </w:r>
+    </w:p>
+    <w:p>
+      <w:pPr>
+        <w:pStyle w:val="ListBullet"/>
+      </w:pPr>
+      <w:r>
+        <w:t>Late training: higher moving-average score and fewer immediate collisions as ε approaches its minimum.</w:t>
       </w:r>
     </w:p>
     <w:p>
       <w:r>
-        <w:t>In “test” mode (ε = 0), the agent demonstrates significantly better survival and food-seeking behavior compared to the random AI baseline. This confirms that the learned policy successfully maximizes cumulative reward.</w:t>
+        <w:t>In test mode (ε = 0), the trained policy typically survives longer and collects food more reliably than the random baseline, demonstrating that the learned Q-function improves decision quality.</w:t>
       </w:r>
     </w:p>
     <w:p>
@@ -627,12 +1169,12 @@
     </w:p>
     <w:p>
       <w:r>
-        <w:t>Challenge: Real-time rendering slows training.</w:t>
+        <w:t>Challenge: Rendering every frame slows training and reduces the number of episodes that can be completed quickly.</w:t>
       </w:r>
     </w:p>
     <w:p>
       <w:r>
-        <w:t>Solution: Fast training mode with optional visualization updates every 50 episodes and headless support for Colab.</w:t>
+        <w:t>Solution: Training runs at high speed, with optional UI refreshes every N episodes; a headless mode disables rendering entirely for notebook/CI environments.</w:t>
       </w:r>
     </w:p>
     <w:p>
@@ -640,17 +1182,27 @@
         <w:rPr>
           <w:b/>
         </w:rPr>
-        <w:t>2. Reward function tuning</w:t>
+        <w:t>2. Reward shaping trade-offs</w:t>
       </w:r>
     </w:p>
     <w:p>
       <w:r>
-        <w:t>Challenge: Overly complex rewards led to suboptimal behaviors.</w:t>
+        <w:t>Attempt 1: Sparse reward (+food, −death) was simple but made exploration slow because useful trajectories are rare early on.</w:t>
       </w:r>
     </w:p>
     <w:p>
       <w:r>
-        <w:t>Solution: Iterative design with three food types (normal/bonus/poison) and lightweight shaping.</w:t>
+        <w:t>Attempt 2: A small living reward (+0.1) increased movement and improved exploration stability.</w:t>
+      </w:r>
+    </w:p>
+    <w:p>
+      <w:r>
+        <w:t>Attempt 3: Stronger directional shaping can speed up learning but may introduce oscillations near the food, so shaping was kept lightweight (penalize moving away only).</w:t>
+      </w:r>
+    </w:p>
+    <w:p>
+      <w:r>
+        <w:t>Final: Keep the main learning signal simple (+food/−death) and use minimal shaping for efficiency; special food types add variety without changing the core objective.</w:t>
       </w:r>
     </w:p>
     <w:p>
@@ -658,17 +1210,17 @@
         <w:rPr>
           <w:b/>
         </w:rPr>
-        <w:t>3. Platform compatibility</w:t>
+        <w:t>3. Platform compatibility (Colab/headless)</w:t>
       </w:r>
     </w:p>
     <w:p>
       <w:r>
-        <w:t>Challenge: Pygame audio and window issues in Colab.</w:t>
+        <w:t>Challenge: Pygame windows/audio often fail in hosted notebook environments.</w:t>
       </w:r>
     </w:p>
     <w:p>
       <w:r>
-        <w:t>Solution: HEADLESS environment variable with dummy drivers.</w:t>
+        <w:t>Solution: Support HEADLESS=1 with dummy drivers; disable audio and screenshots in headless mode.</w:t>
       </w:r>
     </w:p>
     <w:p>
@@ -681,12 +1233,12 @@
     </w:p>
     <w:p>
       <w:r>
-        <w:t>Challenge: Standard grid UI appears plain in demos.</w:t>
+        <w:t>Challenge: A plain grid UI is hard to watch in a demo and does not clearly communicate state/action/reward.</w:t>
       </w:r>
     </w:p>
     <w:p>
       <w:r>
-        <w:t>Solution: Custom dreamy pink theme, animations, combo system, and sound effects.</w:t>
+        <w:t>Solution: A polished UI (info card + mode badge) shows state/action/reward explicitly; visual theme and sound effects improve demo clarity.</w:t>
       </w:r>
     </w:p>
     <w:p>
@@ -705,6 +1257,46 @@
     <w:p>
       <w:r>
         <w:t>Future work may include a target network, Double DQN, or pixel-based state representation for even stronger performance.</w:t>
+      </w:r>
+    </w:p>
+    <w:p>
+      <w:pPr>
+        <w:pStyle w:val="Heading1"/>
+      </w:pPr>
+      <w:r>
+        <w:t>8. References</w:t>
+      </w:r>
+    </w:p>
+    <w:p>
+      <w:pPr>
+        <w:pStyle w:val="ListBullet"/>
+      </w:pPr>
+      <w:r>
+        <w:t>Mnih, V. et al. (2015). Human-level control through deep reinforcement learning. Nature.</w:t>
+      </w:r>
+    </w:p>
+    <w:p>
+      <w:pPr>
+        <w:pStyle w:val="ListBullet"/>
+      </w:pPr>
+      <w:r>
+        <w:t>Sutton, R. S., &amp; Barto, A. G. (2018). Reinforcement Learning: An Introduction (2nd ed.).</w:t>
+      </w:r>
+    </w:p>
+    <w:p>
+      <w:pPr>
+        <w:pStyle w:val="ListBullet"/>
+      </w:pPr>
+      <w:r>
+        <w:t>PyTorch Documentation: https://pytorch.org/docs/</w:t>
+      </w:r>
+    </w:p>
+    <w:p>
+      <w:pPr>
+        <w:pStyle w:val="ListBullet"/>
+      </w:pPr>
+      <w:r>
+        <w:t>Pygame Documentation: https://www.pygame.org/docs/</w:t>
       </w:r>
     </w:p>
     <w:sectPr>

</xml_diff>